<commit_message>
corrected typos, fixed gitignore
</commit_message>
<xml_diff>
--- a/word/example.docx
+++ b/word/example.docx
@@ -107,7 +107,7 @@
         <w:pStyle w:val="Date"/>
       </w:pPr>
       <w:r>
-        <w:t xml:space="preserve">2024-10-09</w:t>
+        <w:t xml:space="preserve">2025-10-29</w:t>
       </w:r>
     </w:p>
     <w:bookmarkStart w:id="24" w:name="abstract"/>
@@ -224,7 +224,7 @@
         <w:pStyle w:val="BodyText"/>
       </w:pPr>
       <w:r>
-        <w:t xml:space="preserve">The mean species length of the modified iris dataset is 5.83.</w:t>
+        <w:t xml:space="preserve">The mean species length of the modified iris dataset is 5.93.</w:t>
       </w:r>
     </w:p>
     <w:bookmarkStart w:id="30" w:name="third-level-heading"/>
@@ -1111,20 +1111,20 @@
         <w:t xml:space="preserve"> </w:t>
       </w:r>
       <w:r>
-        <w:t xml:space="preserve">Then you manually bring those changes back into the .qmd file.</w:t>
-      </w:r>
-      <w:r>
-        <w:br/>
-      </w:r>
-      <w:r>
-        <w:t xml:space="preserve">Sometimes it’s handy to add a</w:t>
+        <w:t xml:space="preserve">Then you manually bring those changes back into the .qmd file. Sometimes it’s</w:t>
+      </w:r>
+      <w:r>
+        <w:t xml:space="preserve"> </w:t>
+      </w:r>
+      <w:r>
+        <w:t xml:space="preserve">handy to add a</w:t>
       </w:r>
       <w:r>
         <w:t xml:space="preserve"> </w:t>
       </w:r>
       <w:commentRangeStart w:id="0"/>
       <w:r>
-        <w:t xml:space="preserve">comment in the actual Word file output.</w:t>
+        <w:t xml:space="preserve">comment in the actual Word file output</w:t>
       </w:r>
       <w:commentRangeEnd w:id="0"/>
       <w:r>
@@ -1132,6 +1132,9 @@
           <w:rStyle w:val="CommentReference"/>
         </w:rPr>
         <w:commentReference w:id="0"/>
+      </w:r>
+      <w:r>
+        <w:t xml:space="preserve">. For comments to readers familiar with markdown, you can add comments in the markdown document itself, either in the body text (see example below in the markdown doc) or in individual R chunks (see any code chunk in the markdown document).</w:t>
       </w:r>
     </w:p>
     <w:bookmarkEnd w:id="33"/>
@@ -1290,7 +1293,7 @@
 
 <file path=word/comments.xml><?xml version="1.0" encoding="utf-8"?>
 <w:comments xmlns:w="http://schemas.openxmlformats.org/wordprocessingml/2006/main" xmlns:m="http://schemas.openxmlformats.org/officeDocument/2006/math" xmlns:r="http://schemas.openxmlformats.org/officeDocument/2006/relationships" xmlns:o="urn:schemas-microsoft-com:office:office" xmlns:v="urn:schemas-microsoft-com:vml" xmlns:w10="urn:schemas-microsoft-com:office:word" xmlns:a="http://schemas.openxmlformats.org/drawingml/2006/main" xmlns:pic="http://schemas.openxmlformats.org/drawingml/2006/picture" xmlns:wp="http://schemas.openxmlformats.org/drawingml/2006/wordprocessingDrawing">
-  <w:comment w:id="0" w:author="The Flying Spahetti Monster" w:date="2300-01-01T10:12:00Z">
+  <w:comment w:id="0" w:author="The Flying Spaghetti Monster" w:date="2300-01-01T10:12:00Z">
     <w:p>
       <w:pPr>
         <w:pStyle w:val="CommentText"/>

</xml_diff>